<commit_message>
feat: refresh work stories and visual system
Add accurate FEMA case studies and resume bullets, then restyle
the site with Geist, left-aligned layout, and a white CTA.

Bump the application version to 1.6.0.
</commit_message>
<xml_diff>
--- a/public/MatthewSmithResume.docx
+++ b/public/MatthewSmithResume.docx
@@ -181,7 +181,7 @@
         <w:t xml:space="preserve">Frontend: </w:t>
       </w:r>
       <w:r>
-        <w:t>TypeScript, Svelte, React, Angular, GWT, Bootstrap, Tailwind</w:t>
+        <w:t>TypeScript, Svelte, React, Angular, GWT, Bootstrap, Tailwind, Playwright</w:t>
       </w:r>
     </w:p>
     <w:p>
@@ -324,7 +324,7 @@
         <w:spacing w:before="40" w:after="40"/>
       </w:pPr>
       <w:r>
-        <w:t>Designed and built the Svelte frontend for a TypeScript monorepo of AWS serverless applications serving as a unified access portal for FEMA platforms including PrepToolkit, RTLT, RIS, and OneResponder.</w:t>
+        <w:t>Delivered a reusable PrepToolkit calendar portlet configurable for HSEEP or REP, with day, month, year, and 8-year views, filtered event APIs, and PDF export.</w:t>
       </w:r>
     </w:p>
     <w:p>
@@ -337,7 +337,7 @@
         <w:spacing w:before="40" w:after="40"/>
       </w:pPr>
       <w:r>
-        <w:t>Automated enterprise reporting with Docmosis and Apache POI, cutting processing time from hours to minutes for national emergency preparedness programs.</w:t>
+        <w:t>Owned a searchable HSEEP exercise-template library and copy workflow, including permission-aware cross-domain access, selective copying of modules and simulation data, and Playwright coverage for creation and compatibility rules.</w:t>
       </w:r>
     </w:p>
     <w:p>
@@ -350,6 +350,32 @@
         <w:spacing w:before="40" w:after="40"/>
       </w:pPr>
       <w:r>
+        <w:t>Built Svelte access-management UI and TypeScript Lambda APIs in a serverless monorepo, covering user-admin workflows for pending requests, current access, activity history, and bulk site-membership changes.</w:t>
+      </w:r>
+    </w:p>
+    <w:p>
+      <w:pPr>
+        <w:pStyle w:val="ListParagraph"/>
+        <w:numPr>
+          <w:ilvl w:val="0"/>
+          <w:numId w:val="2"/>
+        </w:numPr>
+        <w:spacing w:before="40" w:after="40"/>
+      </w:pPr>
+      <w:r>
+        <w:t>Modernized ten FEMA report and data-extract workflows using MySQL JSON functions and Docmosis templates, including current and legacy routing for changing annual assessment requirements.</w:t>
+      </w:r>
+    </w:p>
+    <w:p>
+      <w:pPr>
+        <w:pStyle w:val="ListParagraph"/>
+        <w:numPr>
+          <w:ilvl w:val="0"/>
+          <w:numId w:val="2"/>
+        </w:numPr>
+        <w:spacing w:before="40" w:after="40"/>
+      </w:pPr>
+      <w:r>
         <w:t>Delivered full-stack features that translated FEMA program requirements (THIRA/SPR, CPG, NIMS, UAWG) into technical solutions in coordination with project leads to meet federal compliance and security standards.</w:t>
       </w:r>
     </w:p>
@@ -405,7 +431,7 @@
           <w:sz w:val="18"/>
           <w:szCs w:val="18"/>
         </w:rPr>
-        <w:t>Docker/Podman, Git</w:t>
+        <w:t>Docker/Podman, Git, Playwright</w:t>
       </w:r>
     </w:p>
     <w:p>

</xml_diff>